<commit_message>
Refresh coursework exp2 screenshots and report
</commit_message>
<xml_diff>
--- a/coursework/exp2_session/report/javaweb开发基础课内实验二 2315302125 崔子霖.docx
+++ b/coursework/exp2_session/report/javaweb开发基础课内实验二 2315302125 崔子霖.docx
@@ -859,7 +859,7 @@
           <w:b w:val="0"/>
           <w:sz w:val="24"/>
         </w:rPr>
-        <w:t>2. 在 exam_ans.jsp 页面中接收用户提交的数据，并将考号、选择题答案和判断题答案保存到 session 中，再显示答题结果。随后在 exam_result.jsp 页面中从 session 中读取答案，按照标准答案进行判分，并输出最终成绩。</w:t>
+        <w:t>2. 在 exam_ans.jsp 页面中接收用户提交的数据，使用 request 获取表单参数，并将考号、选择题答案和判断题答案保存到 session 中，再将答题结果回显给用户查看。</w:t>
       </w:r>
     </w:p>
     <w:p>
@@ -879,7 +879,7 @@
               <a:graphicData uri="http://schemas.openxmlformats.org/drawingml/2006/picture">
                 <pic:pic>
                   <pic:nvPicPr>
-                    <pic:cNvPr id="0" name="code_exam_result_jsp.jpg"/>
+                    <pic:cNvPr id="0" name="code_exam_ans_jsp.jpg"/>
                     <pic:cNvPicPr/>
                   </pic:nvPicPr>
                   <pic:blipFill>
@@ -914,7 +914,7 @@
           <w:b w:val="0"/>
           <w:sz w:val="22"/>
         </w:rPr>
-        <w:t>图3 exam_result.jsp 关键代码截图</w:t>
+        <w:t>图3 exam_ans.jsp 关键代码截图</w:t>
       </w:r>
     </w:p>
     <w:p>
@@ -934,7 +934,7 @@
               <a:graphicData uri="http://schemas.openxmlformats.org/drawingml/2006/picture">
                 <pic:pic>
                   <pic:nvPicPr>
-                    <pic:cNvPr id="0" name="run_exam_result.jpg"/>
+                    <pic:cNvPr id="0" name="run_exam_ans.jpg"/>
                     <pic:cNvPicPr/>
                   </pic:nvPicPr>
                   <pic:blipFill>
@@ -969,7 +969,7 @@
           <w:b w:val="0"/>
           <w:sz w:val="22"/>
         </w:rPr>
-        <w:t>图4 exam_result.jsp 运行结果截图</w:t>
+        <w:t>图4 exam_ans.jsp 运行结果截图</w:t>
       </w:r>
     </w:p>
     <w:p>
@@ -984,22 +984,7 @@
           <w:b w:val="0"/>
           <w:sz w:val="24"/>
         </w:rPr>
-        <w:t>3. 编写 visit_count.jsp 页面，利用 application 对象在服务器范围内保存 visitCount 变量。用户每访问一次页面，计数值自动加 1，并将最新结果显示到页面中。</w:t>
-      </w:r>
-    </w:p>
-    <w:p>
-      <w:pPr>
-        <w:spacing w:line="360" w:lineRule="auto"/>
-        <w:ind w:firstLine="420"/>
-        <w:jc w:val="both"/>
-      </w:pPr>
-      <w:r>
-        <w:rPr>
-          <w:rFonts w:ascii="宋体" w:hAnsi="宋体" w:eastAsia="宋体"/>
-          <w:b w:val="0"/>
-          <w:sz w:val="24"/>
-        </w:rPr>
-        <w:t>4. 实验完成后，使用 mvn -DskipTests package 对项目进行了打包验证，确认页面可以正常访问，功能符合实验指导书要求。</w:t>
+        <w:t>3. 在 exam_result.jsp 页面中从 session 中读取答案，按照标准答案进行判分，并输出最终成绩。当用户未经过答题结果页直接访问时，页面会重定向回 exam.jsp。</w:t>
       </w:r>
     </w:p>
     <w:p>
@@ -1019,7 +1004,7 @@
               <a:graphicData uri="http://schemas.openxmlformats.org/drawingml/2006/picture">
                 <pic:pic>
                   <pic:nvPicPr>
-                    <pic:cNvPr id="0" name="code_visit_count_jsp.jpg"/>
+                    <pic:cNvPr id="0" name="code_exam_result_jsp.jpg"/>
                     <pic:cNvPicPr/>
                   </pic:nvPicPr>
                   <pic:blipFill>
@@ -1054,7 +1039,7 @@
           <w:b w:val="0"/>
           <w:sz w:val="22"/>
         </w:rPr>
-        <w:t>图5 visit_count.jsp 关键代码截图</w:t>
+        <w:t>图5 exam_result.jsp 关键代码截图</w:t>
       </w:r>
     </w:p>
     <w:p>
@@ -1074,7 +1059,7 @@
               <a:graphicData uri="http://schemas.openxmlformats.org/drawingml/2006/picture">
                 <pic:pic>
                   <pic:nvPicPr>
-                    <pic:cNvPr id="0" name="run_visit_count.jpg"/>
+                    <pic:cNvPr id="0" name="run_exam_result.jpg"/>
                     <pic:cNvPicPr/>
                   </pic:nvPicPr>
                   <pic:blipFill>
@@ -1109,7 +1094,147 @@
           <w:b w:val="0"/>
           <w:sz w:val="22"/>
         </w:rPr>
-        <w:t>图6 visit_count.jsp 运行结果截图</w:t>
+        <w:t>图6 exam_result.jsp 运行结果截图</w:t>
+      </w:r>
+    </w:p>
+    <w:p>
+      <w:pPr>
+        <w:spacing w:line="360" w:lineRule="auto"/>
+        <w:ind w:firstLine="420"/>
+        <w:jc w:val="both"/>
+      </w:pPr>
+      <w:r>
+        <w:rPr>
+          <w:rFonts w:ascii="宋体" w:hAnsi="宋体" w:eastAsia="宋体"/>
+          <w:b w:val="0"/>
+          <w:sz w:val="24"/>
+        </w:rPr>
+        <w:t>4. 编写 visit_count.jsp 页面，利用 application 对象在服务器范围内保存 visitCount 变量。用户每访问一次页面，计数值自动加 1，并将最新结果显示到页面中。</w:t>
+      </w:r>
+    </w:p>
+    <w:p>
+      <w:pPr>
+        <w:ind w:firstLine="0"/>
+        <w:jc w:val="center"/>
+      </w:pPr>
+      <w:r>
+        <w:drawing>
+          <wp:inline xmlns:a="http://schemas.openxmlformats.org/drawingml/2006/main" xmlns:pic="http://schemas.openxmlformats.org/drawingml/2006/picture">
+            <wp:extent cx="5580000" cy="3621420"/>
+            <wp:docPr id="8" name="Picture 8"/>
+            <wp:cNvGraphicFramePr>
+              <a:graphicFrameLocks noChangeAspect="1"/>
+            </wp:cNvGraphicFramePr>
+            <a:graphic>
+              <a:graphicData uri="http://schemas.openxmlformats.org/drawingml/2006/picture">
+                <pic:pic>
+                  <pic:nvPicPr>
+                    <pic:cNvPr id="0" name="code_visit_count_jsp.jpg"/>
+                    <pic:cNvPicPr/>
+                  </pic:nvPicPr>
+                  <pic:blipFill>
+                    <a:blip r:embed="rId25"/>
+                    <a:stretch>
+                      <a:fillRect/>
+                    </a:stretch>
+                  </pic:blipFill>
+                  <pic:spPr>
+                    <a:xfrm>
+                      <a:off x="0" y="0"/>
+                      <a:ext cx="5580000" cy="3621420"/>
+                    </a:xfrm>
+                    <a:prstGeom prst="rect"/>
+                  </pic:spPr>
+                </pic:pic>
+              </a:graphicData>
+            </a:graphic>
+          </wp:inline>
+        </w:drawing>
+      </w:r>
+    </w:p>
+    <w:p>
+      <w:pPr>
+        <w:spacing w:line="360" w:lineRule="auto"/>
+        <w:ind w:firstLine="0"/>
+        <w:jc w:val="center"/>
+      </w:pPr>
+      <w:r>
+        <w:rPr>
+          <w:rFonts w:ascii="宋体" w:hAnsi="宋体" w:eastAsia="宋体"/>
+          <w:b w:val="0"/>
+          <w:sz w:val="22"/>
+        </w:rPr>
+        <w:t>图7 visit_count.jsp 关键代码截图</w:t>
+      </w:r>
+    </w:p>
+    <w:p>
+      <w:pPr>
+        <w:ind w:firstLine="0"/>
+        <w:jc w:val="center"/>
+      </w:pPr>
+      <w:r>
+        <w:drawing>
+          <wp:inline xmlns:a="http://schemas.openxmlformats.org/drawingml/2006/main" xmlns:pic="http://schemas.openxmlformats.org/drawingml/2006/picture">
+            <wp:extent cx="5580000" cy="3621420"/>
+            <wp:docPr id="9" name="Picture 9"/>
+            <wp:cNvGraphicFramePr>
+              <a:graphicFrameLocks noChangeAspect="1"/>
+            </wp:cNvGraphicFramePr>
+            <a:graphic>
+              <a:graphicData uri="http://schemas.openxmlformats.org/drawingml/2006/picture">
+                <pic:pic>
+                  <pic:nvPicPr>
+                    <pic:cNvPr id="0" name="run_visit_count.jpg"/>
+                    <pic:cNvPicPr/>
+                  </pic:nvPicPr>
+                  <pic:blipFill>
+                    <a:blip r:embed="rId26"/>
+                    <a:stretch>
+                      <a:fillRect/>
+                    </a:stretch>
+                  </pic:blipFill>
+                  <pic:spPr>
+                    <a:xfrm>
+                      <a:off x="0" y="0"/>
+                      <a:ext cx="5580000" cy="3621420"/>
+                    </a:xfrm>
+                    <a:prstGeom prst="rect"/>
+                  </pic:spPr>
+                </pic:pic>
+              </a:graphicData>
+            </a:graphic>
+          </wp:inline>
+        </w:drawing>
+      </w:r>
+    </w:p>
+    <w:p>
+      <w:pPr>
+        <w:spacing w:line="360" w:lineRule="auto"/>
+        <w:ind w:firstLine="0"/>
+        <w:jc w:val="center"/>
+      </w:pPr>
+      <w:r>
+        <w:rPr>
+          <w:rFonts w:ascii="宋体" w:hAnsi="宋体" w:eastAsia="宋体"/>
+          <w:b w:val="0"/>
+          <w:sz w:val="22"/>
+        </w:rPr>
+        <w:t>图8 visit_count.jsp 运行结果截图</w:t>
+      </w:r>
+    </w:p>
+    <w:p>
+      <w:pPr>
+        <w:spacing w:line="360" w:lineRule="auto"/>
+        <w:ind w:firstLine="420"/>
+        <w:jc w:val="both"/>
+      </w:pPr>
+      <w:r>
+        <w:rPr>
+          <w:rFonts w:ascii="宋体" w:hAnsi="宋体" w:eastAsia="宋体"/>
+          <w:b w:val="0"/>
+          <w:sz w:val="24"/>
+        </w:rPr>
+        <w:t>5. 实验完成后，使用 mvn -DskipTests package 对项目进行了打包验证，确认页面可以正常访问，功能符合实验指导书要求。</w:t>
       </w:r>
     </w:p>
     <w:p>

</xml_diff>

<commit_message>
Refresh coursework exp2 browser result screenshots
</commit_message>
<xml_diff>
--- a/coursework/exp2_session/report/javaweb开发基础课内实验二 2315302125 崔子霖.docx
+++ b/coursework/exp2_session/report/javaweb开发基础课内实验二 2315302125 崔子霖.docx
@@ -14,9 +14,8 @@
       </w:pPr>
       <w:r>
         <w:rPr>
-          <w:rFonts w:ascii="宋体" w:eastAsia="宋体" w:hint="eastAsia" w:hAnsi="宋体"/>
-          <w:b w:val="0"/>
-          <w:sz w:val="32"/>
+          <w:rFonts w:ascii="楷体_GB2312" w:eastAsia="楷体_GB2312" w:hint="eastAsia"/>
+          <w:sz w:val="52"/>
           <w:szCs w:val="52"/>
         </w:rPr>
         <w:t>南京理工大学紫金学院</w:t>
@@ -25,9 +24,7 @@
     <w:p>
       <w:pPr>
         <w:pStyle w:val="1"/>
-        <w:spacing w:line="360" w:lineRule="auto"/>
-        <w:ind w:firstLine="0"/>
-        <w:jc w:val="center"/>
+        <w:spacing w:line="276" w:lineRule="auto"/>
         <w:rPr>
           <w:rFonts w:ascii="方正小标宋简体" w:eastAsia="方正小标宋简体"/>
           <w:b w:val="0"/>
@@ -38,7 +35,7 @@
         <w:rPr>
           <w:rFonts w:ascii="宋体" w:hAnsi="宋体" w:eastAsia="宋体"/>
           <w:b w:val="0"/>
-          <w:sz w:val="32"/>
+          <w:sz w:val="24"/>
         </w:rPr>
         <w:t>《Java Web开发基础》实验报告</w:t>
       </w:r>
@@ -50,7 +47,10 @@
       </w:pPr>
       <w:r>
         <w:rPr>
+          <w:rFonts w:ascii="宋体" w:hAnsi="宋体" w:eastAsia="宋体"/>
+          <w:b w:val="0"/>
           <w:noProof/>
+          <w:sz w:val="24"/>
         </w:rPr>
         <w:drawing>
           <wp:inline distT="0" distB="0" distL="0" distR="0" wp14:anchorId="0A057FA2" wp14:editId="0FFE1A09">
@@ -148,15 +148,7 @@
             <w:vAlign w:val="center"/>
           </w:tcPr>
           <w:p>
-            <w:pPr>
-              <w:jc w:val="center"/>
-            </w:pPr>
             <w:r>
-              <w:rPr>
-                <w:rFonts w:ascii="宋体" w:hAnsi="宋体" w:eastAsia="宋体"/>
-                <w:b w:val="0"/>
-                <w:sz w:val="24"/>
-              </w:rPr>
               <w:t>03415011</w:t>
             </w:r>
           </w:p>
@@ -204,15 +196,7 @@
             <w:vAlign w:val="center"/>
           </w:tcPr>
           <w:p>
-            <w:pPr>
-              <w:jc w:val="center"/>
-            </w:pPr>
             <w:r>
-              <w:rPr>
-                <w:rFonts w:ascii="宋体" w:hAnsi="宋体" w:eastAsia="宋体"/>
-                <w:b w:val="0"/>
-                <w:sz w:val="24"/>
-              </w:rPr>
               <w:t>Java Web开发基础</w:t>
             </w:r>
           </w:p>
@@ -282,15 +266,7 @@
             <w:vAlign w:val="center"/>
           </w:tcPr>
           <w:p>
-            <w:pPr>
-              <w:jc w:val="center"/>
-            </w:pPr>
             <w:r>
-              <w:rPr>
-                <w:rFonts w:ascii="宋体" w:hAnsi="宋体" w:eastAsia="宋体"/>
-                <w:b w:val="0"/>
-                <w:sz w:val="24"/>
-              </w:rPr>
               <w:t>计算机学院</w:t>
             </w:r>
           </w:p>
@@ -358,15 +334,7 @@
             <w:vAlign w:val="center"/>
           </w:tcPr>
           <w:p>
-            <w:pPr>
-              <w:jc w:val="center"/>
-            </w:pPr>
             <w:r>
-              <w:rPr>
-                <w:rFonts w:ascii="宋体" w:hAnsi="宋体" w:eastAsia="宋体"/>
-                <w:b w:val="0"/>
-                <w:sz w:val="24"/>
-              </w:rPr>
               <w:t>计算机科学与技术</w:t>
             </w:r>
           </w:p>
@@ -405,15 +373,7 @@
             <w:vAlign w:val="center"/>
           </w:tcPr>
           <w:p>
-            <w:pPr>
-              <w:jc w:val="center"/>
-            </w:pPr>
             <w:r>
-              <w:rPr>
-                <w:rFonts w:ascii="宋体" w:hAnsi="宋体" w:eastAsia="宋体"/>
-                <w:b w:val="0"/>
-                <w:sz w:val="24"/>
-              </w:rPr>
               <w:t>2315302125</w:t>
             </w:r>
           </w:p>
@@ -452,15 +412,7 @@
             <w:vAlign w:val="center"/>
           </w:tcPr>
           <w:p>
-            <w:pPr>
-              <w:jc w:val="center"/>
-            </w:pPr>
             <w:r>
-              <w:rPr>
-                <w:rFonts w:ascii="宋体" w:hAnsi="宋体" w:eastAsia="宋体"/>
-                <w:b w:val="0"/>
-                <w:sz w:val="24"/>
-              </w:rPr>
               <w:t>崔子霖</w:t>
             </w:r>
           </w:p>
@@ -508,15 +460,7 @@
             <w:vAlign w:val="center"/>
           </w:tcPr>
           <w:p>
-            <w:pPr>
-              <w:jc w:val="center"/>
-            </w:pPr>
             <w:r>
-              <w:rPr>
-                <w:rFonts w:ascii="宋体" w:hAnsi="宋体" w:eastAsia="宋体"/>
-                <w:b w:val="0"/>
-                <w:sz w:val="24"/>
-              </w:rPr>
               <w:t>童安玲</w:t>
             </w:r>
           </w:p>
@@ -527,6 +471,11 @@
     <w:p/>
     <w:p>
       <w:r>
+        <w:rPr>
+          <w:rFonts w:ascii="宋体" w:hAnsi="宋体" w:eastAsia="宋体"/>
+          <w:b w:val="0"/>
+          <w:sz w:val="24"/>
+        </w:rPr>
         <w:br w:type="textWrapping" w:clear="all"/>
       </w:r>
     </w:p>
@@ -555,8 +504,6 @@
     </w:p>
     <w:p>
       <w:pPr>
-        <w:spacing w:line="360" w:lineRule="auto"/>
-        <w:ind w:firstLine="0"/>
         <w:jc w:val="center"/>
       </w:pPr>
       <w:r>
@@ -593,9 +540,7 @@
     <w:p>
       <w:pPr>
         <w:pStyle w:val="2"/>
-        <w:spacing w:line="360" w:lineRule="auto"/>
-        <w:ind w:firstLine="0"/>
-        <w:jc w:val="both"/>
+        <w:jc w:val="center"/>
         <w:rPr>
           <w:rFonts w:ascii="宋体" w:eastAsia="宋体" w:hAnsi="宋体"/>
           <w:bCs/>
@@ -607,7 +552,7 @@
         <w:rPr>
           <w:rFonts w:ascii="宋体" w:hAnsi="宋体" w:eastAsia="宋体"/>
           <w:b w:val="0"/>
-          <w:sz w:val="28"/>
+          <w:sz w:val="24"/>
         </w:rPr>
         <w:t>实验2 内置对象-session的应用</w:t>
       </w:r>
@@ -632,16 +577,15 @@
           <w:rFonts w:hint="eastAsia" w:ascii="宋体" w:hAnsi="宋体" w:eastAsia="宋体"/>
           <w:b/>
           <w:bCs/>
-          <w:sz w:val="28"/>
+          <w:sz w:val="24"/>
         </w:rPr>
         <w:t>实验目的</w:t>
       </w:r>
     </w:p>
     <w:p>
       <w:pPr>
-        <w:spacing w:line="360" w:lineRule="auto"/>
-        <w:ind w:firstLine="420"/>
-        <w:jc w:val="both"/>
+        <w:spacing w:line="360" w:lineRule="auto" w:after="0"/>
+        <w:ind w:firstLine="480"/>
       </w:pPr>
       <w:r>
         <w:rPr>
@@ -654,9 +598,8 @@
     </w:p>
     <w:p>
       <w:pPr>
-        <w:spacing w:line="360" w:lineRule="auto"/>
-        <w:ind w:firstLine="420"/>
-        <w:jc w:val="both"/>
+        <w:spacing w:line="360" w:lineRule="auto" w:after="0"/>
+        <w:ind w:firstLine="480"/>
       </w:pPr>
       <w:r>
         <w:rPr>
@@ -664,14 +607,13 @@
           <w:b w:val="0"/>
           <w:sz w:val="24"/>
         </w:rPr>
-        <w:t>2. 掌握通过 exam.jsp、exam_ans.jsp 与 exam_result.jsp 完成在线考试、答题结果显示和成绩计算的方法。</w:t>
+        <w:t>2. 掌握通过 exam.jsp、exam_ans.jsp 和 exam_result.jsp 完成在线考试、答题结果显示及成绩计算的方法。</w:t>
       </w:r>
     </w:p>
     <w:p>
       <w:pPr>
-        <w:spacing w:line="360" w:lineRule="auto"/>
-        <w:ind w:firstLine="420"/>
-        <w:jc w:val="both"/>
+        <w:spacing w:line="360" w:lineRule="auto" w:after="0"/>
+        <w:ind w:firstLine="480"/>
       </w:pPr>
       <w:r>
         <w:rPr>
@@ -679,8 +621,16 @@
           <w:b w:val="0"/>
           <w:sz w:val="24"/>
         </w:rPr>
-        <w:t>3. 熟悉 application 对象的基本使用方式，能够利用 visit_count.jsp 实现简单的网站访问计数功能。</w:t>
+        <w:t>3. 熟悉 application 对象的使用方式，能够利用 visit_count.jsp 实现简单的网站访问计数功能。</w:t>
       </w:r>
+    </w:p>
+    <w:p>
+      <w:pPr>
+        <w:spacing w:line="360" w:lineRule="auto"/>
+        <w:rPr>
+          <w:sz w:val="24"/>
+        </w:rPr>
+      </w:pPr>
     </w:p>
     <w:p>
       <w:pPr>
@@ -702,16 +652,15 @@
           <w:rFonts w:hint="eastAsia" w:ascii="宋体" w:hAnsi="宋体" w:eastAsia="宋体"/>
           <w:b/>
           <w:bCs/>
-          <w:sz w:val="28"/>
+          <w:sz w:val="24"/>
         </w:rPr>
         <w:t>实验内容</w:t>
       </w:r>
     </w:p>
     <w:p>
       <w:pPr>
-        <w:spacing w:line="360" w:lineRule="auto"/>
-        <w:ind w:firstLine="420"/>
-        <w:jc w:val="both"/>
+        <w:spacing w:line="360" w:lineRule="auto" w:after="0"/>
+        <w:ind w:firstLine="480"/>
       </w:pPr>
       <w:r>
         <w:rPr>
@@ -719,14 +668,13 @@
           <w:b w:val="0"/>
           <w:sz w:val="24"/>
         </w:rPr>
-        <w:t>本次实验在 IntelliJ IDEA 中完成，项目使用 Maven 进行构建，并通过 Tomcat 运行 JSP 页面。实验内容分为两部分：一是使用 session 对象模拟在线考试系统；二是使用 application 对象实现网站访问计数。</w:t>
+        <w:t>本次实验在 IntelliJ IDEA 中完成，项目使用 Maven 构建，并通过 Tomcat 部署运行。实验内容包括两部分：一是使用 session 对象模拟在线考试系统；二是使用 application 对象实现网页访问计数。</w:t>
       </w:r>
     </w:p>
     <w:p>
       <w:pPr>
-        <w:spacing w:line="360" w:lineRule="auto"/>
-        <w:ind w:firstLine="420"/>
-        <w:jc w:val="both"/>
+        <w:spacing w:line="360" w:lineRule="auto" w:after="0"/>
+        <w:ind w:firstLine="480"/>
       </w:pPr>
       <w:r>
         <w:rPr>
@@ -734,18 +682,37 @@
           <w:b w:val="0"/>
           <w:sz w:val="24"/>
         </w:rPr>
-        <w:t>1. 编写 exam.jsp 页面，设置考号输入框、单选题与判断题表单，用户填写后将数据提交到 exam_ans.jsp 页面。该页面主要负责试题展示和表单提交。</w:t>
+        <w:t>1. 编写 exam.jsp 页面，设置考号输入框、单选题和判断题表单，用户填写答案后提交到 exam_ans.jsp 页面。该页面用于展示试卷内容并接收作答信息。</w:t>
       </w:r>
     </w:p>
     <w:p>
       <w:pPr>
-        <w:ind w:firstLine="0"/>
+        <w:spacing w:line="288" w:lineRule="auto"/>
         <w:jc w:val="center"/>
       </w:pPr>
       <w:r>
+        <w:rPr>
+          <w:rFonts w:ascii="宋体" w:hAnsi="宋体" w:eastAsia="宋体"/>
+          <w:b w:val="0"/>
+          <w:sz w:val="22"/>
+        </w:rPr>
+        <w:t>图1 exam.jsp 关键代码截图</w:t>
+      </w:r>
+    </w:p>
+    <w:p>
+      <w:pPr>
+        <w:spacing w:after="0"/>
+        <w:jc w:val="center"/>
+      </w:pPr>
+      <w:r>
+        <w:rPr>
+          <w:rFonts w:ascii="宋体" w:hAnsi="宋体" w:eastAsia="宋体"/>
+          <w:b w:val="0"/>
+          <w:sz w:val="24"/>
+        </w:rPr>
         <w:drawing>
           <wp:inline xmlns:a="http://schemas.openxmlformats.org/drawingml/2006/main" xmlns:pic="http://schemas.openxmlformats.org/drawingml/2006/picture">
-            <wp:extent cx="5580000" cy="3621420"/>
+            <wp:extent cx="5120640" cy="3322726"/>
             <wp:docPr id="2" name="Picture 2"/>
             <wp:cNvGraphicFramePr>
               <a:graphicFrameLocks noChangeAspect="1"/>
@@ -766,7 +733,7 @@
                   <pic:spPr>
                     <a:xfrm>
                       <a:off x="0" y="0"/>
-                      <a:ext cx="5580000" cy="3621420"/>
+                      <a:ext cx="5120640" cy="3322726"/>
                     </a:xfrm>
                     <a:prstGeom prst="rect"/>
                   </pic:spPr>
@@ -779,28 +746,32 @@
     </w:p>
     <w:p>
       <w:pPr>
-        <w:spacing w:line="360" w:lineRule="auto"/>
-        <w:ind w:firstLine="0"/>
+        <w:spacing w:line="288" w:lineRule="auto"/>
         <w:jc w:val="center"/>
       </w:pPr>
       <w:r>
         <w:rPr>
           <w:rFonts w:ascii="宋体" w:hAnsi="宋体" w:eastAsia="宋体"/>
-          <w:b/>
-          <w:sz w:val="28"/>
+          <w:b w:val="0"/>
+          <w:sz w:val="22"/>
         </w:rPr>
-        <w:t>图1 exam.jsp 关键代码截图</w:t>
+        <w:t>图2 exam.jsp 浏览器运行结果截图</w:t>
       </w:r>
     </w:p>
     <w:p>
       <w:pPr>
-        <w:ind w:firstLine="0"/>
+        <w:spacing w:after="0"/>
         <w:jc w:val="center"/>
       </w:pPr>
       <w:r>
+        <w:rPr>
+          <w:rFonts w:ascii="宋体" w:hAnsi="宋体" w:eastAsia="宋体"/>
+          <w:b w:val="0"/>
+          <w:sz w:val="24"/>
+        </w:rPr>
         <w:drawing>
           <wp:inline xmlns:a="http://schemas.openxmlformats.org/drawingml/2006/main" xmlns:pic="http://schemas.openxmlformats.org/drawingml/2006/picture">
-            <wp:extent cx="5580000" cy="3621420"/>
+            <wp:extent cx="5120640" cy="3322726"/>
             <wp:docPr id="3" name="Picture 3"/>
             <wp:cNvGraphicFramePr>
               <a:graphicFrameLocks noChangeAspect="1"/>
@@ -821,7 +792,7 @@
                   <pic:spPr>
                     <a:xfrm>
                       <a:off x="0" y="0"/>
-                      <a:ext cx="5580000" cy="3621420"/>
+                      <a:ext cx="5120640" cy="3322726"/>
                     </a:xfrm>
                     <a:prstGeom prst="rect"/>
                   </pic:spPr>
@@ -834,8 +805,21 @@
     </w:p>
     <w:p>
       <w:pPr>
-        <w:spacing w:line="360" w:lineRule="auto"/>
-        <w:ind w:firstLine="0"/>
+        <w:spacing w:line="360" w:lineRule="auto" w:after="0"/>
+        <w:ind w:firstLine="480"/>
+      </w:pPr>
+      <w:r>
+        <w:rPr>
+          <w:rFonts w:ascii="宋体" w:hAnsi="宋体" w:eastAsia="宋体"/>
+          <w:b w:val="0"/>
+          <w:sz w:val="24"/>
+        </w:rPr>
+        <w:t>2. 在 exam_ans.jsp 页面中通过 request 获取表单参数，并将考号、选择题答案和判断题答案保存到 session 中，再将本次作答结果回显给用户查看。</w:t>
+      </w:r>
+    </w:p>
+    <w:p>
+      <w:pPr>
+        <w:spacing w:line="288" w:lineRule="auto"/>
         <w:jc w:val="center"/>
       </w:pPr>
       <w:r>
@@ -844,14 +828,13 @@
           <w:b w:val="0"/>
           <w:sz w:val="22"/>
         </w:rPr>
-        <w:t>图2 exam.jsp 运行结果截图</w:t>
+        <w:t>图3 exam_ans.jsp 关键代码截图</w:t>
       </w:r>
     </w:p>
     <w:p>
       <w:pPr>
-        <w:spacing w:line="360" w:lineRule="auto"/>
-        <w:ind w:firstLine="420"/>
-        <w:jc w:val="both"/>
+        <w:spacing w:after="0"/>
+        <w:jc w:val="center"/>
       </w:pPr>
       <w:r>
         <w:rPr>
@@ -859,18 +842,9 @@
           <w:b w:val="0"/>
           <w:sz w:val="24"/>
         </w:rPr>
-        <w:t>2. 在 exam_ans.jsp 页面中接收用户提交的数据，使用 request 获取表单参数，并将考号、选择题答案和判断题答案保存到 session 中，再将答题结果回显给用户查看。</w:t>
-      </w:r>
-    </w:p>
-    <w:p>
-      <w:pPr>
-        <w:ind w:firstLine="0"/>
-        <w:jc w:val="center"/>
-      </w:pPr>
-      <w:r>
         <w:drawing>
           <wp:inline xmlns:a="http://schemas.openxmlformats.org/drawingml/2006/main" xmlns:pic="http://schemas.openxmlformats.org/drawingml/2006/picture">
-            <wp:extent cx="5580000" cy="3621420"/>
+            <wp:extent cx="5120640" cy="3322726"/>
             <wp:docPr id="4" name="Picture 4"/>
             <wp:cNvGraphicFramePr>
               <a:graphicFrameLocks noChangeAspect="1"/>
@@ -891,7 +865,7 @@
                   <pic:spPr>
                     <a:xfrm>
                       <a:off x="0" y="0"/>
-                      <a:ext cx="5580000" cy="3621420"/>
+                      <a:ext cx="5120640" cy="3322726"/>
                     </a:xfrm>
                     <a:prstGeom prst="rect"/>
                   </pic:spPr>
@@ -904,8 +878,7 @@
     </w:p>
     <w:p>
       <w:pPr>
-        <w:spacing w:line="360" w:lineRule="auto"/>
-        <w:ind w:firstLine="0"/>
+        <w:spacing w:line="288" w:lineRule="auto"/>
         <w:jc w:val="center"/>
       </w:pPr>
       <w:r>
@@ -914,18 +887,23 @@
           <w:b w:val="0"/>
           <w:sz w:val="22"/>
         </w:rPr>
-        <w:t>图3 exam_ans.jsp 关键代码截图</w:t>
+        <w:t>图4 exam_ans.jsp 浏览器运行结果截图</w:t>
       </w:r>
     </w:p>
     <w:p>
       <w:pPr>
-        <w:ind w:firstLine="0"/>
+        <w:spacing w:after="0"/>
         <w:jc w:val="center"/>
       </w:pPr>
       <w:r>
+        <w:rPr>
+          <w:rFonts w:ascii="宋体" w:hAnsi="宋体" w:eastAsia="宋体"/>
+          <w:b w:val="0"/>
+          <w:sz w:val="24"/>
+        </w:rPr>
         <w:drawing>
           <wp:inline xmlns:a="http://schemas.openxmlformats.org/drawingml/2006/main" xmlns:pic="http://schemas.openxmlformats.org/drawingml/2006/picture">
-            <wp:extent cx="5580000" cy="3621420"/>
+            <wp:extent cx="5120640" cy="3322726"/>
             <wp:docPr id="5" name="Picture 5"/>
             <wp:cNvGraphicFramePr>
               <a:graphicFrameLocks noChangeAspect="1"/>
@@ -946,7 +924,7 @@
                   <pic:spPr>
                     <a:xfrm>
                       <a:off x="0" y="0"/>
-                      <a:ext cx="5580000" cy="3621420"/>
+                      <a:ext cx="5120640" cy="3322726"/>
                     </a:xfrm>
                     <a:prstGeom prst="rect"/>
                   </pic:spPr>
@@ -959,8 +937,21 @@
     </w:p>
     <w:p>
       <w:pPr>
-        <w:spacing w:line="360" w:lineRule="auto"/>
-        <w:ind w:firstLine="0"/>
+        <w:spacing w:line="360" w:lineRule="auto" w:after="0"/>
+        <w:ind w:firstLine="480"/>
+      </w:pPr>
+      <w:r>
+        <w:rPr>
+          <w:rFonts w:ascii="宋体" w:hAnsi="宋体" w:eastAsia="宋体"/>
+          <w:b w:val="0"/>
+          <w:sz w:val="24"/>
+        </w:rPr>
+        <w:t>3. 在 exam_result.jsp 页面中从 session 读取答案，按照标准答案进行判分并输出最终成绩；如果用户未按正常流程访问该页面，则重定向回 exam.jsp。</w:t>
+      </w:r>
+    </w:p>
+    <w:p>
+      <w:pPr>
+        <w:spacing w:line="288" w:lineRule="auto"/>
         <w:jc w:val="center"/>
       </w:pPr>
       <w:r>
@@ -969,14 +960,13 @@
           <w:b w:val="0"/>
           <w:sz w:val="22"/>
         </w:rPr>
-        <w:t>图4 exam_ans.jsp 运行结果截图</w:t>
+        <w:t>图5 exam_result.jsp 关键代码截图</w:t>
       </w:r>
     </w:p>
     <w:p>
       <w:pPr>
-        <w:spacing w:line="360" w:lineRule="auto"/>
-        <w:ind w:firstLine="420"/>
-        <w:jc w:val="both"/>
+        <w:spacing w:after="0"/>
+        <w:jc w:val="center"/>
       </w:pPr>
       <w:r>
         <w:rPr>
@@ -984,18 +974,9 @@
           <w:b w:val="0"/>
           <w:sz w:val="24"/>
         </w:rPr>
-        <w:t>3. 在 exam_result.jsp 页面中从 session 中读取答案，按照标准答案进行判分，并输出最终成绩。当用户未经过答题结果页直接访问时，页面会重定向回 exam.jsp。</w:t>
-      </w:r>
-    </w:p>
-    <w:p>
-      <w:pPr>
-        <w:ind w:firstLine="0"/>
-        <w:jc w:val="center"/>
-      </w:pPr>
-      <w:r>
         <w:drawing>
           <wp:inline xmlns:a="http://schemas.openxmlformats.org/drawingml/2006/main" xmlns:pic="http://schemas.openxmlformats.org/drawingml/2006/picture">
-            <wp:extent cx="5580000" cy="3621420"/>
+            <wp:extent cx="5120640" cy="3322726"/>
             <wp:docPr id="6" name="Picture 6"/>
             <wp:cNvGraphicFramePr>
               <a:graphicFrameLocks noChangeAspect="1"/>
@@ -1016,7 +997,7 @@
                   <pic:spPr>
                     <a:xfrm>
                       <a:off x="0" y="0"/>
-                      <a:ext cx="5580000" cy="3621420"/>
+                      <a:ext cx="5120640" cy="3322726"/>
                     </a:xfrm>
                     <a:prstGeom prst="rect"/>
                   </pic:spPr>
@@ -1029,8 +1010,7 @@
     </w:p>
     <w:p>
       <w:pPr>
-        <w:spacing w:line="360" w:lineRule="auto"/>
-        <w:ind w:firstLine="0"/>
+        <w:spacing w:line="288" w:lineRule="auto"/>
         <w:jc w:val="center"/>
       </w:pPr>
       <w:r>
@@ -1039,18 +1019,23 @@
           <w:b w:val="0"/>
           <w:sz w:val="22"/>
         </w:rPr>
-        <w:t>图5 exam_result.jsp 关键代码截图</w:t>
+        <w:t>图6 exam_result.jsp 浏览器运行结果截图</w:t>
       </w:r>
     </w:p>
     <w:p>
       <w:pPr>
-        <w:ind w:firstLine="0"/>
+        <w:spacing w:after="0"/>
         <w:jc w:val="center"/>
       </w:pPr>
       <w:r>
+        <w:rPr>
+          <w:rFonts w:ascii="宋体" w:hAnsi="宋体" w:eastAsia="宋体"/>
+          <w:b w:val="0"/>
+          <w:sz w:val="24"/>
+        </w:rPr>
         <w:drawing>
           <wp:inline xmlns:a="http://schemas.openxmlformats.org/drawingml/2006/main" xmlns:pic="http://schemas.openxmlformats.org/drawingml/2006/picture">
-            <wp:extent cx="5580000" cy="3621420"/>
+            <wp:extent cx="5120640" cy="3322726"/>
             <wp:docPr id="7" name="Picture 7"/>
             <wp:cNvGraphicFramePr>
               <a:graphicFrameLocks noChangeAspect="1"/>
@@ -1071,7 +1056,7 @@
                   <pic:spPr>
                     <a:xfrm>
                       <a:off x="0" y="0"/>
-                      <a:ext cx="5580000" cy="3621420"/>
+                      <a:ext cx="5120640" cy="3322726"/>
                     </a:xfrm>
                     <a:prstGeom prst="rect"/>
                   </pic:spPr>
@@ -1084,8 +1069,21 @@
     </w:p>
     <w:p>
       <w:pPr>
-        <w:spacing w:line="360" w:lineRule="auto"/>
-        <w:ind w:firstLine="0"/>
+        <w:spacing w:line="360" w:lineRule="auto" w:after="0"/>
+        <w:ind w:firstLine="480"/>
+      </w:pPr>
+      <w:r>
+        <w:rPr>
+          <w:rFonts w:ascii="宋体" w:hAnsi="宋体" w:eastAsia="宋体"/>
+          <w:b w:val="0"/>
+          <w:sz w:val="24"/>
+        </w:rPr>
+        <w:t>4. 编写 visit_count.jsp 页面，利用 application 对象在服务器范围内保存 visitCount 变量。用户每访问一次页面，计数值自动加 1，并在浏览器中显示最新访问次数。</w:t>
+      </w:r>
+    </w:p>
+    <w:p>
+      <w:pPr>
+        <w:spacing w:line="288" w:lineRule="auto"/>
         <w:jc w:val="center"/>
       </w:pPr>
       <w:r>
@@ -1094,14 +1092,13 @@
           <w:b w:val="0"/>
           <w:sz w:val="22"/>
         </w:rPr>
-        <w:t>图6 exam_result.jsp 运行结果截图</w:t>
+        <w:t>图7 visit_count.jsp 关键代码截图</w:t>
       </w:r>
     </w:p>
     <w:p>
       <w:pPr>
-        <w:spacing w:line="360" w:lineRule="auto"/>
-        <w:ind w:firstLine="420"/>
-        <w:jc w:val="both"/>
+        <w:spacing w:after="0"/>
+        <w:jc w:val="center"/>
       </w:pPr>
       <w:r>
         <w:rPr>
@@ -1109,18 +1106,9 @@
           <w:b w:val="0"/>
           <w:sz w:val="24"/>
         </w:rPr>
-        <w:t>4. 编写 visit_count.jsp 页面，利用 application 对象在服务器范围内保存 visitCount 变量。用户每访问一次页面，计数值自动加 1，并将最新结果显示到页面中。</w:t>
-      </w:r>
-    </w:p>
-    <w:p>
-      <w:pPr>
-        <w:ind w:firstLine="0"/>
-        <w:jc w:val="center"/>
-      </w:pPr>
-      <w:r>
         <w:drawing>
           <wp:inline xmlns:a="http://schemas.openxmlformats.org/drawingml/2006/main" xmlns:pic="http://schemas.openxmlformats.org/drawingml/2006/picture">
-            <wp:extent cx="5580000" cy="3621420"/>
+            <wp:extent cx="5120640" cy="3322726"/>
             <wp:docPr id="8" name="Picture 8"/>
             <wp:cNvGraphicFramePr>
               <a:graphicFrameLocks noChangeAspect="1"/>
@@ -1141,7 +1129,7 @@
                   <pic:spPr>
                     <a:xfrm>
                       <a:off x="0" y="0"/>
-                      <a:ext cx="5580000" cy="3621420"/>
+                      <a:ext cx="5120640" cy="3322726"/>
                     </a:xfrm>
                     <a:prstGeom prst="rect"/>
                   </pic:spPr>
@@ -1154,8 +1142,7 @@
     </w:p>
     <w:p>
       <w:pPr>
-        <w:spacing w:line="360" w:lineRule="auto"/>
-        <w:ind w:firstLine="0"/>
+        <w:spacing w:line="288" w:lineRule="auto"/>
         <w:jc w:val="center"/>
       </w:pPr>
       <w:r>
@@ -1164,18 +1151,23 @@
           <w:b w:val="0"/>
           <w:sz w:val="22"/>
         </w:rPr>
-        <w:t>图7 visit_count.jsp 关键代码截图</w:t>
+        <w:t>图8 visit_count.jsp 浏览器运行结果截图</w:t>
       </w:r>
     </w:p>
     <w:p>
       <w:pPr>
-        <w:ind w:firstLine="0"/>
+        <w:spacing w:after="0"/>
         <w:jc w:val="center"/>
       </w:pPr>
       <w:r>
+        <w:rPr>
+          <w:rFonts w:ascii="宋体" w:hAnsi="宋体" w:eastAsia="宋体"/>
+          <w:b w:val="0"/>
+          <w:sz w:val="24"/>
+        </w:rPr>
         <w:drawing>
           <wp:inline xmlns:a="http://schemas.openxmlformats.org/drawingml/2006/main" xmlns:pic="http://schemas.openxmlformats.org/drawingml/2006/picture">
-            <wp:extent cx="5580000" cy="3621420"/>
+            <wp:extent cx="5120640" cy="3322726"/>
             <wp:docPr id="9" name="Picture 9"/>
             <wp:cNvGraphicFramePr>
               <a:graphicFrameLocks noChangeAspect="1"/>
@@ -1196,7 +1188,7 @@
                   <pic:spPr>
                     <a:xfrm>
                       <a:off x="0" y="0"/>
-                      <a:ext cx="5580000" cy="3621420"/>
+                      <a:ext cx="5120640" cy="3322726"/>
                     </a:xfrm>
                     <a:prstGeom prst="rect"/>
                   </pic:spPr>
@@ -1209,24 +1201,8 @@
     </w:p>
     <w:p>
       <w:pPr>
-        <w:spacing w:line="360" w:lineRule="auto"/>
-        <w:ind w:firstLine="0"/>
-        <w:jc w:val="center"/>
-      </w:pPr>
-      <w:r>
-        <w:rPr>
-          <w:rFonts w:ascii="宋体" w:hAnsi="宋体" w:eastAsia="宋体"/>
-          <w:b w:val="0"/>
-          <w:sz w:val="22"/>
-        </w:rPr>
-        <w:t>图8 visit_count.jsp 运行结果截图</w:t>
-      </w:r>
-    </w:p>
-    <w:p>
-      <w:pPr>
-        <w:spacing w:line="360" w:lineRule="auto"/>
-        <w:ind w:firstLine="420"/>
-        <w:jc w:val="both"/>
+        <w:spacing w:line="360" w:lineRule="auto" w:after="0"/>
+        <w:ind w:firstLine="480"/>
       </w:pPr>
       <w:r>
         <w:rPr>
@@ -1234,8 +1210,18 @@
           <w:b w:val="0"/>
           <w:sz w:val="24"/>
         </w:rPr>
-        <w:t>5. 实验完成后，使用 mvn -DskipTests package 对项目进行了打包验证，确认页面可以正常访问，功能符合实验指导书要求。</w:t>
+        <w:t>5. 实验完成后，执行 mvn -DskipTests package 对项目进行了打包验证，构建成功，说明页面可以正常访问且功能满足实验要求。</w:t>
       </w:r>
+    </w:p>
+    <w:p>
+      <w:pPr>
+        <w:spacing w:line="360" w:lineRule="auto"/>
+        <w:rPr>
+          <w:b/>
+          <w:bCs/>
+          <w:sz w:val="24"/>
+        </w:rPr>
+      </w:pPr>
     </w:p>
     <w:p>
       <w:pPr>
@@ -1254,7 +1240,7 @@
       </w:pPr>
       <w:r>
         <w:rPr>
-          <w:rFonts w:hint="eastAsia"/>
+          <w:rFonts w:hint="eastAsia" w:ascii="宋体" w:hAnsi="宋体" w:eastAsia="宋体"/>
           <w:b/>
           <w:bCs/>
           <w:sz w:val="24"/>
@@ -1264,9 +1250,8 @@
     </w:p>
     <w:p>
       <w:pPr>
-        <w:spacing w:line="360" w:lineRule="auto"/>
-        <w:ind w:firstLine="420"/>
-        <w:jc w:val="both"/>
+        <w:spacing w:line="360" w:lineRule="auto" w:after="0"/>
+        <w:ind w:firstLine="480"/>
       </w:pPr>
       <w:r>
         <w:rPr>
@@ -1274,14 +1259,13 @@
           <w:b w:val="0"/>
           <w:sz w:val="24"/>
         </w:rPr>
-        <w:t>通过本次实验，我进一步理解了 session 对象和 application 对象的区别。session 适合保存当前用户会话中的独立数据，例如考号和试题答案；application 适合保存多个用户都可以访问的共享数据，例如网站访问次数。</w:t>
+        <w:t>通过本次实验，我进一步理解了 session 对象和 application 对象的区别。session 更适合保存当前用户会话中的独立数据，例如考号和试题答案；application 更适合保存多个用户共享的数据，例如网站访问次数。</w:t>
       </w:r>
     </w:p>
     <w:p>
       <w:pPr>
-        <w:spacing w:line="360" w:lineRule="auto"/>
-        <w:ind w:firstLine="420"/>
-        <w:jc w:val="both"/>
+        <w:spacing w:line="360" w:lineRule="auto" w:after="0"/>
+        <w:ind w:firstLine="480"/>
       </w:pPr>
       <w:r>
         <w:rPr>
@@ -1294,9 +1278,8 @@
     </w:p>
     <w:p>
       <w:pPr>
-        <w:spacing w:line="360" w:lineRule="auto"/>
-        <w:ind w:firstLine="420"/>
-        <w:jc w:val="both"/>
+        <w:spacing w:line="360" w:lineRule="auto" w:after="0"/>
+        <w:ind w:firstLine="480"/>
       </w:pPr>
       <w:r>
         <w:rPr>
@@ -1304,7 +1287,7 @@
           <w:b w:val="0"/>
           <w:sz w:val="24"/>
         </w:rPr>
-        <w:t>本次实验还让我进一步熟悉了 IntelliJ IDEA、Tomcat 和 Maven 的配合使用。后续我会继续加强对 JSP、Servlet 以及 Java Web 各类内置对象的综合应用能力。</w:t>
+        <w:t>本次实验还让我进一步熟悉了 IntelliJ IDEA、Tomcat 和 Maven 的协同使用。后续我会继续加强对 JSP、Servlet 以及 Java Web 各类内置对象的综合应用能力。</w:t>
       </w:r>
     </w:p>
     <w:sectPr>

</xml_diff>